<commit_message>
permiresim template kontrata familje dhe indivd
</commit_message>
<xml_diff>
--- a/templates/kontrata-familje.docx
+++ b/templates/kontrata-familje.docx
@@ -28841,10 +28841,6 @@
         </w:tc>
       </w:tr>
     </w:tbl>
-    <w:p>
-      <w:bookmarkStart w:id="11" w:name="_GoBack"/>
-      <w:bookmarkEnd w:id="11"/>
-    </w:p>
     <w:p/>
     <w:p/>
     <w:p/>
@@ -28879,738 +28875,13 @@
     <w:p/>
     <w:p/>
     <w:p/>
-    <w:bookmarkStart w:id="12" w:name="_MON_1827661170"/>
-    <w:bookmarkEnd w:id="12"/>
-    <w:p>
-      <w:r>
-        <w:object w:dxaOrig="1539" w:dyaOrig="997" w14:anchorId="35949617">
-          <v:shapetype id="_x0000_t75" coordsize="21600,21600" o:spt="75" o:preferrelative="t" path="m@4@5l@4@11@9@11@9@5xe" filled="f" stroked="f">
-            <v:stroke joinstyle="miter"/>
-            <v:formulas>
-              <v:f eqn="if lineDrawn pixelLineWidth 0"/>
-              <v:f eqn="sum @0 1 0"/>
-              <v:f eqn="sum 0 0 @1"/>
-              <v:f eqn="prod @2 1 2"/>
-              <v:f eqn="prod @3 21600 pixelWidth"/>
-              <v:f eqn="prod @3 21600 pixelHeight"/>
-              <v:f eqn="sum @0 0 1"/>
-              <v:f eqn="prod @6 1 2"/>
-              <v:f eqn="prod @7 21600 pixelWidth"/>
-              <v:f eqn="sum @8 21600 0"/>
-              <v:f eqn="prod @7 21600 pixelHeight"/>
-              <v:f eqn="sum @10 21600 0"/>
-            </v:formulas>
-            <v:path o:extrusionok="f" gradientshapeok="t" o:connecttype="rect"/>
-            <o:lock v:ext="edit" aspectratio="t"/>
-          </v:shapetype>
-          <v:shape id="_x0000_i1025" type="#_x0000_t75" style="width:78pt;height:49.5pt" o:ole="">
-            <v:imagedata r:id="rId10" o:title=""/>
-          </v:shape>
-          <o:OLEObject Type="Embed" ProgID="Word.Document.12" ShapeID="_x0000_i1025" DrawAspect="Icon" ObjectID="_1833987020" r:id="rId11">
-            <o:FieldCodes>\s</o:FieldCodes>
-          </o:OLEObject>
-        </w:object>
-      </w:r>
-    </w:p>
-    <w:p>
-      <w:pPr>
-        <w:rPr>
-          <w:b/>
-          <w:bCs/>
-          <w:sz w:val="22"/>
-          <w:szCs w:val="22"/>
-          <w:lang w:val="sq-AL"/>
-        </w:rPr>
-      </w:pPr>
-      <w:r>
-        <w:rPr>
-          <w:b/>
-          <w:bCs/>
-          <w:sz w:val="22"/>
-          <w:szCs w:val="22"/>
-          <w:lang w:val="sq-AL"/>
-        </w:rPr>
-        <w:t>Anex</w:t>
-      </w:r>
-      <w:r>
-        <w:rPr>
-          <w:sz w:val="22"/>
-          <w:szCs w:val="22"/>
-          <w:lang w:val="sq-AL"/>
-        </w:rPr>
-        <w:t xml:space="preserve"> </w:t>
-      </w:r>
-      <w:r>
-        <w:rPr>
-          <w:b/>
-          <w:bCs/>
-          <w:sz w:val="22"/>
-          <w:szCs w:val="22"/>
-          <w:lang w:val="sq-AL"/>
-        </w:rPr>
-        <w:t>2</w:t>
-      </w:r>
-      <w:r>
-        <w:rPr>
-          <w:b/>
-          <w:bCs/>
-          <w:sz w:val="22"/>
-          <w:szCs w:val="22"/>
-          <w:lang w:val="sq-AL"/>
-        </w:rPr>
-        <w:t xml:space="preserve"> - </w:t>
-      </w:r>
-      <w:r>
-        <w:rPr>
-          <w:b/>
-          <w:bCs/>
-          <w:sz w:val="22"/>
-          <w:szCs w:val="22"/>
-          <w:lang w:val="sq-AL"/>
-        </w:rPr>
-        <w:t xml:space="preserve">DOKUMENTACIONI I NEVOJSHËM ME RASTIN E KËRKESËS PËR RIMBURSIM </w:t>
-      </w:r>
-    </w:p>
-    <w:p>
-      <w:pPr>
-        <w:rPr>
-          <w:sz w:val="22"/>
-          <w:szCs w:val="22"/>
-          <w:lang w:val="sq-AL"/>
-        </w:rPr>
-      </w:pPr>
-    </w:p>
-    <w:p>
-      <w:pPr>
-        <w:pStyle w:val="TableParagraph"/>
-        <w:rPr>
-          <w:rFonts w:ascii="Times New Roman" w:hAnsi="Times New Roman" w:cs="Times New Roman"/>
-          <w:lang w:val="sq-AL"/>
-        </w:rPr>
-      </w:pPr>
-      <w:r>
-        <w:rPr>
-          <w:rFonts w:ascii="Times New Roman" w:hAnsi="Times New Roman" w:cs="Times New Roman"/>
-          <w:lang w:val="sq-AL"/>
-        </w:rPr>
-        <w:t xml:space="preserve">Formulari i kërkesës për rimbursim duhet te prezantohet ne </w:t>
-      </w:r>
-      <w:r>
-        <w:rPr>
-          <w:rFonts w:ascii="Times New Roman" w:hAnsi="Times New Roman" w:cs="Times New Roman"/>
-          <w:lang w:val="sq-AL"/>
-        </w:rPr>
-        <w:t>SIGAL</w:t>
-      </w:r>
-      <w:r>
-        <w:rPr>
-          <w:rFonts w:ascii="Times New Roman" w:hAnsi="Times New Roman" w:cs="Times New Roman"/>
-          <w:lang w:val="sq-AL"/>
-        </w:rPr>
-        <w:t xml:space="preserve"> i plotësuar saktë ne të gjitha fushat e kërkuara.</w:t>
-      </w:r>
-    </w:p>
-    <w:p>
-      <w:pPr>
-        <w:pStyle w:val="TableParagraph"/>
-        <w:rPr>
-          <w:rFonts w:ascii="Times New Roman" w:hAnsi="Times New Roman" w:cs="Times New Roman"/>
-          <w:lang w:val="sq-AL"/>
-        </w:rPr>
-      </w:pPr>
-    </w:p>
-    <w:p>
-      <w:pPr>
-        <w:pStyle w:val="TableParagraph"/>
-        <w:rPr>
-          <w:rFonts w:ascii="Times New Roman" w:hAnsi="Times New Roman" w:cs="Times New Roman"/>
-          <w:lang w:val="sq-AL"/>
-        </w:rPr>
-      </w:pPr>
-      <w:r>
-        <w:rPr>
-          <w:rFonts w:ascii="Times New Roman" w:hAnsi="Times New Roman" w:cs="Times New Roman"/>
-          <w:lang w:val="sq-AL"/>
-        </w:rPr>
-        <w:t>Secila kërkesë për rimbursim duhet të jetë e kompletuar me dokumentacionin mbështetës si me poshtë:</w:t>
-      </w:r>
-    </w:p>
-    <w:p>
-      <w:pPr>
-        <w:pStyle w:val="ListParagraph"/>
-        <w:ind w:hanging="360"/>
-        <w:rPr>
-          <w:sz w:val="22"/>
-          <w:szCs w:val="22"/>
-          <w:lang w:val="sq-AL"/>
-        </w:rPr>
-      </w:pPr>
-    </w:p>
-    <w:p>
-      <w:pPr>
-        <w:pStyle w:val="ListParagraph"/>
-        <w:widowControl w:val="0"/>
-        <w:numPr>
-          <w:ilvl w:val="0"/>
-          <w:numId w:val="32"/>
-        </w:numPr>
-        <w:autoSpaceDE w:val="0"/>
-        <w:autoSpaceDN w:val="0"/>
-        <w:rPr>
-          <w:sz w:val="22"/>
-          <w:szCs w:val="22"/>
-          <w:lang w:val="sq-AL"/>
-        </w:rPr>
-      </w:pPr>
-      <w:r>
-        <w:rPr>
-          <w:sz w:val="22"/>
-          <w:szCs w:val="22"/>
-          <w:lang w:val="sq-AL"/>
-        </w:rPr>
-        <w:t>Kërkesë për Rimbursim (me fokus të veçantë plotësoni fushat e cekura më poshtë dhe bashkëlidhni dokumentet e nevojshme):</w:t>
-      </w:r>
-    </w:p>
-    <w:p>
-      <w:pPr>
-        <w:pStyle w:val="ListParagraph"/>
-        <w:numPr>
-          <w:ilvl w:val="0"/>
-          <w:numId w:val="33"/>
-        </w:numPr>
-        <w:autoSpaceDN w:val="0"/>
-        <w:contextualSpacing/>
-        <w:rPr>
-          <w:sz w:val="22"/>
-          <w:szCs w:val="22"/>
-          <w:lang w:val="sq-AL"/>
-        </w:rPr>
-      </w:pPr>
-      <w:r>
-        <w:rPr>
-          <w:sz w:val="22"/>
-          <w:szCs w:val="22"/>
-          <w:lang w:val="sq-AL"/>
-        </w:rPr>
-        <w:t xml:space="preserve"> Emër/Mbiemër  </w:t>
-      </w:r>
-    </w:p>
-    <w:p>
-      <w:pPr>
-        <w:pStyle w:val="ListParagraph"/>
-        <w:ind w:left="1440" w:hanging="360"/>
-        <w:rPr>
-          <w:sz w:val="22"/>
-          <w:szCs w:val="22"/>
-          <w:lang w:val="sq-AL"/>
-        </w:rPr>
-      </w:pPr>
-      <w:r>
-        <w:rPr>
-          <w:sz w:val="22"/>
-          <w:szCs w:val="22"/>
-          <w:lang w:val="sq-AL"/>
-        </w:rPr>
-        <w:t>b.   Numri i telefonit</w:t>
-      </w:r>
-    </w:p>
-    <w:p>
-      <w:pPr>
-        <w:pStyle w:val="ListParagraph"/>
-        <w:ind w:left="1440" w:hanging="360"/>
-        <w:rPr>
-          <w:sz w:val="22"/>
-          <w:szCs w:val="22"/>
-          <w:lang w:val="sq-AL"/>
-        </w:rPr>
-      </w:pPr>
-      <w:r>
-        <w:rPr>
-          <w:sz w:val="22"/>
-          <w:szCs w:val="22"/>
-          <w:lang w:val="sq-AL"/>
-        </w:rPr>
-        <w:t>c.   Adresa dhe e-mail adresa</w:t>
-      </w:r>
-    </w:p>
-    <w:p>
-      <w:pPr>
-        <w:pStyle w:val="ListParagraph"/>
-        <w:ind w:left="1440" w:hanging="360"/>
-        <w:rPr>
-          <w:sz w:val="22"/>
-          <w:szCs w:val="22"/>
-          <w:lang w:val="sq-AL"/>
-        </w:rPr>
-      </w:pPr>
-      <w:r>
-        <w:rPr>
-          <w:sz w:val="22"/>
-          <w:szCs w:val="22"/>
-          <w:lang w:val="sq-AL"/>
-        </w:rPr>
-        <w:t>d.   Vlerat e kërkuara për rimbursim</w:t>
-      </w:r>
-    </w:p>
-    <w:p>
-      <w:pPr>
-        <w:pStyle w:val="ListParagraph"/>
-        <w:ind w:left="1440" w:hanging="360"/>
-        <w:rPr>
-          <w:sz w:val="22"/>
-          <w:szCs w:val="22"/>
-          <w:lang w:val="sq-AL"/>
-        </w:rPr>
-      </w:pPr>
-      <w:r>
-        <w:rPr>
-          <w:sz w:val="22"/>
-          <w:szCs w:val="22"/>
-          <w:lang w:val="sq-AL"/>
-        </w:rPr>
-        <w:t>e.   Emër/Mbiemër dhe numrin e llogarisë së përfituesit</w:t>
-      </w:r>
-    </w:p>
-    <w:p>
-      <w:pPr>
-        <w:pStyle w:val="ListParagraph"/>
-        <w:ind w:hanging="360"/>
-        <w:rPr>
-          <w:sz w:val="22"/>
-          <w:szCs w:val="22"/>
-          <w:lang w:val="sq-AL"/>
-        </w:rPr>
-      </w:pPr>
-      <w:r>
-        <w:rPr>
-          <w:sz w:val="22"/>
-          <w:szCs w:val="22"/>
-          <w:lang w:val="sq-AL"/>
-        </w:rPr>
-        <w:t>2.    Raportet mjekësore (të kompletuara)</w:t>
-      </w:r>
-    </w:p>
-    <w:p>
-      <w:pPr>
-        <w:pStyle w:val="ListParagraph"/>
-        <w:ind w:hanging="360"/>
-        <w:rPr>
-          <w:sz w:val="22"/>
-          <w:szCs w:val="22"/>
-          <w:lang w:val="sq-AL"/>
-        </w:rPr>
-      </w:pPr>
-      <w:r>
-        <w:rPr>
-          <w:sz w:val="22"/>
-          <w:szCs w:val="22"/>
-          <w:lang w:val="sq-AL"/>
-        </w:rPr>
-        <w:t>4.    Rezultatet e analizave, MRI, CT, RTG, UT dhe te tjera (nëse keni kryer)</w:t>
-      </w:r>
-    </w:p>
-    <w:p>
-      <w:pPr>
-        <w:pStyle w:val="ListParagraph"/>
-        <w:ind w:hanging="360"/>
-        <w:rPr>
-          <w:sz w:val="22"/>
-          <w:szCs w:val="22"/>
-          <w:lang w:val="sq-AL"/>
-        </w:rPr>
-      </w:pPr>
-      <w:r>
-        <w:rPr>
-          <w:sz w:val="22"/>
-          <w:szCs w:val="22"/>
-          <w:lang w:val="sq-AL"/>
-        </w:rPr>
-        <w:t>5.    Kuponat fiskal origjinal.</w:t>
-      </w:r>
-    </w:p>
-    <w:p>
-      <w:pPr>
-        <w:pStyle w:val="ListParagraph"/>
-        <w:ind w:hanging="360"/>
-        <w:rPr>
-          <w:sz w:val="22"/>
-          <w:szCs w:val="22"/>
-          <w:lang w:val="sq-AL"/>
-        </w:rPr>
-      </w:pPr>
-      <w:r>
-        <w:rPr>
-          <w:sz w:val="22"/>
-          <w:szCs w:val="22"/>
-          <w:lang w:val="sq-AL"/>
-        </w:rPr>
-        <w:t>6.    Kopja e ID kartës së sigurimit të shëndetit</w:t>
-      </w:r>
-    </w:p>
-    <w:p>
-      <w:pPr>
-        <w:pStyle w:val="ListParagraph"/>
-        <w:ind w:hanging="360"/>
-        <w:rPr>
-          <w:sz w:val="22"/>
-          <w:szCs w:val="22"/>
-          <w:lang w:val="sq-AL"/>
-        </w:rPr>
-      </w:pPr>
-      <w:r>
-        <w:rPr>
-          <w:sz w:val="22"/>
-          <w:szCs w:val="22"/>
-          <w:lang w:val="sq-AL"/>
-        </w:rPr>
-        <w:t>7.    Kopja e letërnjoftimit</w:t>
-      </w:r>
-    </w:p>
-    <w:p>
-      <w:pPr>
-        <w:pStyle w:val="ListParagraph"/>
-        <w:ind w:hanging="360"/>
-        <w:rPr>
-          <w:sz w:val="22"/>
-          <w:szCs w:val="22"/>
-          <w:lang w:val="sq-AL"/>
-        </w:rPr>
-      </w:pPr>
-      <w:r>
-        <w:rPr>
-          <w:sz w:val="22"/>
-          <w:szCs w:val="22"/>
-          <w:lang w:val="sq-AL"/>
-        </w:rPr>
-        <w:t>8.    Dokumente të tjera të cilat ju i shihni si të nevojshme për vlerësimin e kërkesës për rimbursim.</w:t>
-      </w:r>
-    </w:p>
-    <w:p>
-      <w:pPr>
-        <w:pStyle w:val="ListParagraph"/>
-        <w:ind w:hanging="360"/>
-        <w:rPr>
-          <w:sz w:val="22"/>
-          <w:szCs w:val="22"/>
-          <w:lang w:val="sq-AL"/>
-        </w:rPr>
-      </w:pPr>
-    </w:p>
-    <w:p>
-      <w:pPr>
-        <w:pStyle w:val="TableParagraph"/>
-        <w:rPr>
-          <w:rFonts w:ascii="Times New Roman" w:hAnsi="Times New Roman" w:cs="Times New Roman"/>
-          <w:lang w:val="sq-AL"/>
-        </w:rPr>
-      </w:pPr>
-      <w:r>
-        <w:rPr>
-          <w:rFonts w:ascii="Times New Roman" w:hAnsi="Times New Roman" w:cs="Times New Roman"/>
-          <w:lang w:val="sq-AL"/>
-        </w:rPr>
-        <w:t>Keni parasysh, që kërkesat duhet të jenë të ndara ne zarfe individuale dhe jo të grupuara me ato të familjarëve (“Një zarf për Një të siguruar” – Shih më poshtë).</w:t>
-      </w:r>
-    </w:p>
-    <w:p>
-      <w:pPr>
-        <w:rPr>
-          <w:sz w:val="22"/>
-          <w:szCs w:val="22"/>
-          <w:lang w:val="sq-AL"/>
-        </w:rPr>
-      </w:pPr>
-      <w:r>
-        <w:rPr>
-          <w:noProof/>
-          <w:sz w:val="22"/>
-          <w:szCs w:val="22"/>
-          <w:lang w:eastAsia="en-US"/>
-        </w:rPr>
-        <w:drawing>
-          <wp:anchor distT="0" distB="0" distL="114300" distR="114300" simplePos="0" relativeHeight="251659264" behindDoc="0" locked="0" layoutInCell="1" allowOverlap="1" wp14:anchorId="775F000D" wp14:editId="224C527F">
-            <wp:simplePos x="914400" y="5000368"/>
-            <wp:positionH relativeFrom="margin">
-              <wp:align>left</wp:align>
-            </wp:positionH>
-            <wp:positionV relativeFrom="paragraph">
-              <wp:align>top</wp:align>
-            </wp:positionV>
-            <wp:extent cx="3171190" cy="2282825"/>
-            <wp:effectExtent l="0" t="0" r="0" b="3175"/>
-            <wp:wrapSquare wrapText="bothSides"/>
-            <wp:docPr id="1" name="Picture 1" descr="A close-up of a document&#10;&#10;AI-generated content may be incorrect."/>
-            <wp:cNvGraphicFramePr>
-              <a:graphicFrameLocks xmlns:a="http://schemas.openxmlformats.org/drawingml/2006/main" noChangeAspect="1"/>
-            </wp:cNvGraphicFramePr>
-            <a:graphic xmlns:a="http://schemas.openxmlformats.org/drawingml/2006/main">
-              <a:graphicData uri="http://schemas.openxmlformats.org/drawingml/2006/picture">
-                <pic:pic xmlns:pic="http://schemas.openxmlformats.org/drawingml/2006/picture">
-                  <pic:nvPicPr>
-                    <pic:cNvPr id="1" name="Picture 1" descr="A close-up of a document&#10;&#10;AI-generated content may be incorrect."/>
-                    <pic:cNvPicPr>
-                      <a:picLocks noChangeAspect="1" noChangeArrowheads="1"/>
-                    </pic:cNvPicPr>
-                  </pic:nvPicPr>
-                  <pic:blipFill>
-                    <a:blip r:embed="rId12" cstate="print">
-                      <a:extLst>
-                        <a:ext uri="{28A0092B-C50C-407E-A947-70E740481C1C}">
-                          <a14:useLocalDpi xmlns:a14="http://schemas.microsoft.com/office/drawing/2010/main" val="0"/>
-                        </a:ext>
-                      </a:extLst>
-                    </a:blip>
-                    <a:srcRect/>
-                    <a:stretch>
-                      <a:fillRect/>
-                    </a:stretch>
-                  </pic:blipFill>
-                  <pic:spPr bwMode="auto">
-                    <a:xfrm>
-                      <a:off x="0" y="0"/>
-                      <a:ext cx="3171190" cy="2282825"/>
-                    </a:xfrm>
-                    <a:prstGeom prst="rect">
-                      <a:avLst/>
-                    </a:prstGeom>
-                    <a:noFill/>
-                    <a:ln>
-                      <a:noFill/>
-                    </a:ln>
-                  </pic:spPr>
-                </pic:pic>
-              </a:graphicData>
-            </a:graphic>
-            <wp14:sizeRelH relativeFrom="margin">
-              <wp14:pctWidth>0</wp14:pctWidth>
-            </wp14:sizeRelH>
-            <wp14:sizeRelV relativeFrom="margin">
-              <wp14:pctHeight>0</wp14:pctHeight>
-            </wp14:sizeRelV>
-          </wp:anchor>
-        </w:drawing>
-      </w:r>
-      <w:r>
-        <w:rPr>
-          <w:sz w:val="22"/>
-          <w:szCs w:val="22"/>
-          <w:lang w:val="sq-AL"/>
-        </w:rPr>
-        <w:br w:type="textWrapping" w:clear="all"/>
-      </w:r>
-    </w:p>
-    <w:p>
-      <w:pPr>
-        <w:pStyle w:val="Heading1"/>
-        <w:rPr>
-          <w:rFonts w:ascii="Times New Roman" w:eastAsia="Arial" w:hAnsi="Times New Roman"/>
-          <w:b/>
-          <w:bCs/>
-          <w:sz w:val="22"/>
-          <w:szCs w:val="22"/>
-          <w:lang w:val="sq-AL" w:bidi="en-US"/>
-        </w:rPr>
-      </w:pPr>
-      <w:r>
-        <w:rPr>
-          <w:rFonts w:ascii="Times New Roman" w:eastAsia="Arial" w:hAnsi="Times New Roman"/>
-          <w:sz w:val="22"/>
-          <w:szCs w:val="22"/>
-          <w:lang w:val="sq-AL" w:bidi="en-US"/>
-        </w:rPr>
-        <w:t>Për çdo pyetje, koment apo ankesë lidhur me shërbimet e Sigurimit privat te shëndetit, luteni të na shkruani në:</w:t>
-      </w:r>
-    </w:p>
-    <w:p>
-      <w:pPr>
-        <w:rPr>
-          <w:sz w:val="22"/>
-          <w:szCs w:val="22"/>
-          <w:lang w:val="sq-AL"/>
-        </w:rPr>
-      </w:pPr>
-    </w:p>
-    <w:p>
-      <w:pPr>
-        <w:pStyle w:val="Heading1"/>
-        <w:ind w:left="360"/>
-        <w:rPr>
-          <w:rStyle w:val="Strong"/>
-          <w:rFonts w:ascii="Times New Roman" w:hAnsi="Times New Roman"/>
-          <w:sz w:val="22"/>
-          <w:szCs w:val="22"/>
-          <w:lang w:val="sq-AL"/>
-        </w:rPr>
-      </w:pPr>
-      <w:r>
-        <w:rPr>
-          <w:rFonts w:ascii="Times New Roman" w:hAnsi="Times New Roman"/>
-          <w:sz w:val="22"/>
-          <w:szCs w:val="22"/>
-          <w:lang w:val="sq-AL"/>
-        </w:rPr>
-        <w:t xml:space="preserve">Departamenti i dëmeve shëndetësore:  </w:t>
-      </w:r>
-      <w:hyperlink r:id="rId13" w:history="1">
-        <w:r>
-          <w:rPr>
-            <w:rStyle w:val="Hyperlink"/>
-            <w:rFonts w:ascii="Times New Roman" w:hAnsi="Times New Roman"/>
-            <w:color w:val="auto"/>
-            <w:sz w:val="22"/>
-            <w:szCs w:val="22"/>
-            <w:lang w:val="sq-AL"/>
-          </w:rPr>
-          <w:t>demetshendetsore@sigal-ks.com</w:t>
-        </w:r>
-      </w:hyperlink>
-      <w:r>
-        <w:rPr>
-          <w:rStyle w:val="Strong"/>
-          <w:rFonts w:ascii="Times New Roman" w:hAnsi="Times New Roman"/>
-          <w:sz w:val="22"/>
-          <w:szCs w:val="22"/>
-          <w:lang w:val="sq-AL"/>
-        </w:rPr>
-        <w:t xml:space="preserve"> </w:t>
-      </w:r>
-    </w:p>
-    <w:p>
-      <w:pPr>
-        <w:rPr>
-          <w:sz w:val="22"/>
-          <w:szCs w:val="22"/>
-          <w:u w:val="single"/>
-          <w:lang w:val="sq-AL"/>
-        </w:rPr>
-      </w:pPr>
-      <w:r>
-        <w:rPr>
-          <w:b/>
-          <w:bCs/>
-          <w:sz w:val="22"/>
-          <w:szCs w:val="22"/>
-          <w:lang w:val="sq-AL"/>
-        </w:rPr>
-        <w:tab/>
-      </w:r>
-      <w:r>
-        <w:rPr>
-          <w:b/>
-          <w:bCs/>
-          <w:sz w:val="22"/>
-          <w:szCs w:val="22"/>
-          <w:lang w:val="sq-AL"/>
-        </w:rPr>
-        <w:tab/>
-      </w:r>
-      <w:r>
-        <w:rPr>
-          <w:b/>
-          <w:bCs/>
-          <w:sz w:val="22"/>
-          <w:szCs w:val="22"/>
-          <w:lang w:val="sq-AL"/>
-        </w:rPr>
-        <w:tab/>
-      </w:r>
-      <w:r>
-        <w:rPr>
-          <w:b/>
-          <w:bCs/>
-          <w:sz w:val="22"/>
-          <w:szCs w:val="22"/>
-          <w:lang w:val="sq-AL"/>
-        </w:rPr>
-        <w:tab/>
-      </w:r>
-      <w:r>
-        <w:rPr>
-          <w:b/>
-          <w:bCs/>
-          <w:sz w:val="22"/>
-          <w:szCs w:val="22"/>
-          <w:lang w:val="sq-AL"/>
-        </w:rPr>
-        <w:tab/>
-        <w:t xml:space="preserve">              </w:t>
-      </w:r>
-      <w:hyperlink r:id="rId14" w:history="1">
-        <w:r>
-          <w:rPr>
-            <w:rStyle w:val="Hyperlink"/>
-            <w:color w:val="auto"/>
-            <w:sz w:val="22"/>
-            <w:szCs w:val="22"/>
-            <w:lang w:val="sq-AL"/>
-          </w:rPr>
-          <w:t>info@sigal-ks.com</w:t>
-        </w:r>
-      </w:hyperlink>
-    </w:p>
-    <w:p>
-      <w:pPr>
-        <w:pStyle w:val="Heading1"/>
-        <w:ind w:left="360"/>
-        <w:rPr>
-          <w:rFonts w:ascii="Times New Roman" w:hAnsi="Times New Roman"/>
-          <w:sz w:val="22"/>
-          <w:szCs w:val="22"/>
-          <w:lang w:val="sq-AL"/>
-        </w:rPr>
-      </w:pPr>
-      <w:r>
-        <w:rPr>
-          <w:rStyle w:val="Strong"/>
-          <w:rFonts w:ascii="Times New Roman" w:hAnsi="Times New Roman"/>
-          <w:sz w:val="22"/>
-          <w:szCs w:val="22"/>
-          <w:lang w:val="sq-AL"/>
-        </w:rPr>
-        <w:t>Adresa Postare:</w:t>
-      </w:r>
-      <w:r>
-        <w:rPr>
-          <w:rFonts w:ascii="Times New Roman" w:hAnsi="Times New Roman"/>
-          <w:sz w:val="22"/>
-          <w:szCs w:val="22"/>
-          <w:lang w:val="sq-AL"/>
-        </w:rPr>
-        <w:br/>
-      </w:r>
-      <w:r>
-        <w:rPr>
-          <w:rFonts w:ascii="Times New Roman" w:hAnsi="Times New Roman"/>
-          <w:b/>
-          <w:bCs/>
-          <w:sz w:val="20"/>
-          <w14:ligatures w14:val="standardContextual"/>
-        </w:rPr>
-        <w:t>SIGAL Insurance Group</w:t>
-      </w:r>
-      <w:r>
-        <w:rPr>
-          <w:rFonts w:ascii="Times New Roman" w:hAnsi="Times New Roman"/>
-          <w:sz w:val="22"/>
-          <w:szCs w:val="22"/>
-          <w:lang w:val="sq-AL"/>
-        </w:rPr>
-        <w:br/>
-      </w:r>
-      <w:r>
-        <w:rPr>
-          <w:rFonts w:ascii="Times New Roman" w:eastAsia="MS Mincho" w:hAnsi="Times New Roman"/>
-          <w:sz w:val="22"/>
-          <w:szCs w:val="22"/>
-          <w:lang w:val="sq-AL"/>
-        </w:rPr>
-        <w:t>Adresa: Rr. “Ukshin Hoti”, Nr.19, Pejton,  Prishtinë, Kosovë</w:t>
-      </w:r>
-    </w:p>
-    <w:p/>
+    <w:p>
+      <w:bookmarkStart w:id="11" w:name="_GoBack"/>
+      <w:bookmarkEnd w:id="11"/>
+    </w:p>
     <w:sectPr>
-      <w:headerReference w:type="default" r:id="rId15"/>
-      <w:footerReference w:type="default" r:id="rId16"/>
+      <w:headerReference w:type="default" r:id="rId10"/>
+      <w:footerReference w:type="default" r:id="rId11"/>
       <w:pgSz w:w="12240" w:h="15840" w:code="1"/>
       <w:pgMar w:top="1440" w:right="1395" w:bottom="1440" w:left="1440" w:header="0" w:footer="432" w:gutter="0"/>
       <w:cols w:sep="1" w:space="567"/>
@@ -29696,7 +28967,7 @@
         <w:noProof/>
         <w:sz w:val="20"/>
       </w:rPr>
-      <w:t>14</w:t>
+      <w:t>16</w:t>
     </w:r>
     <w:r>
       <w:rPr>
@@ -29751,7 +29022,7 @@
         <w:noProof/>
         <w:sz w:val="20"/>
       </w:rPr>
-      <w:t>18</w:t>
+      <w:t>17</w:t>
     </w:r>
     <w:r>
       <w:rPr>
@@ -35900,7 +35171,7 @@
 </file>
 
 <file path=customXml/itemProps1.xml><?xml version="1.0" encoding="utf-8"?>
-<ds:datastoreItem xmlns:ds="http://schemas.openxmlformats.org/officeDocument/2006/customXml" ds:itemID="{0C3B1E95-E310-45C2-8609-35394F85159B}">
+<ds:datastoreItem xmlns:ds="http://schemas.openxmlformats.org/officeDocument/2006/customXml" ds:itemID="{569DC307-36BD-49E1-85F3-3F4D9711CAD8}">
   <ds:schemaRefs>
     <ds:schemaRef ds:uri="http://schemas.openxmlformats.org/officeDocument/2006/bibliography"/>
   </ds:schemaRefs>

</xml_diff>